<commit_message>
📄 DOCX firmado: GHH180822830 - 7/10/2026, 8:33:10 p.m.
</commit_message>
<xml_diff>
--- a/data/declaraciones/signed/GHH180822830.docx
+++ b/data/declaraciones/signed/GHH180822830.docx
@@ -4230,7 +4230,7 @@
         <w:rPr>
           <w:lang w:val="es-MX"/>
         </w:rPr>
-        <w:t xml:space="preserve">JAIME MICHA SMEKE</w:t>
+        <w:t xml:space="preserve">LIZETH SALINAS LOZANO</w:t>
       </w:r>
       <w:proofErr w:type="spellStart"/>
       <w:r>
@@ -4353,7 +4353,7 @@
         <w:rPr>
           <w:lang w:val="es-MX"/>
         </w:rPr>
-        <w:t xml:space="preserve">Fecha: 29 de septiembre de 2026</w:t>
+        <w:t xml:space="preserve">Fecha: 07 de octubre de 2026</w:t>
       </w:r>
       <w:proofErr w:type="spellStart"/>
       <w:r>

</xml_diff>